<commit_message>
Word reports: App Inv+WP ministry letter layout and tooling
- GenerateTemplates: Inv+WP margins (1200 twips), stepped ministry recipient block, tighter body/Goşundy spacing, salutation bold without underline, urgency italic in default black without underline, signatory table uses printable width.

- Add MinistryRecipientBlockFormatter; AppInvAndWPLetterReportDef exposes recipient line placeholders.

- PreviewWordReports: timestamped output when default path is locked; preset includes split recipient lines.

- Regenerate Module letter/item .docx templates; update App_Inv_And_WP_app_map.md, WORD_REPORT_GENERATION_IDEA.md, and visa2026-word-reports skill notes.

Co-authored-by: Cursor <cursoragent@cursor.com>
</commit_message>
<xml_diff>
--- a/Visa2026.Module/Resources/App_Additional_WP_Location_Letter.docx
+++ b/Visa2026.Module/Resources/App_Additional_WP_Location_Letter.docx
@@ -72,35 +72,35 @@
           <w:rFonts w:ascii="Times New Roman" w:hAnsi="Times New Roman"/>
           <w:sz w:val="30"/>
         </w:rPr>
-        <w:t xml:space="preserve">    {{ds.ProjectContract_Description}}</w:t>
-      </w:r>
-    </w:p>
-    <w:p>
-      <w:pPr>
-        <w:jc w:val="both"/>
-        <w:ind w:firstLine="720"/>
-        <w:spacing w:after="160"/>
-      </w:pPr>
-      <w:r>
-        <w:rPr>
-          <w:rFonts w:ascii="Times New Roman" w:hAnsi="Times New Roman"/>
-          <w:sz w:val="30"/>
-        </w:rPr>
-        <w:t xml:space="preserve">    Şertname esasynda, öňde goýlan wezipeleri ýetinlikli durmuşa geçirmek üçin hatymyzyň goşundysynda görkezilen "{{ds.Company_Name}}" kompaniýasyna degişli bolan {{ds.TotalPersonCount}} ({{ds.TotalPersonCountText}}) sany daşary ýurt raýatynyň {{ds.MovementPermitLocation_NameTm}} iş rugsatnamalarynyň berilmegine ýardam bermegiňizi Sizden haýyş edýäris.</w:t>
-      </w:r>
-    </w:p>
-    <w:p>
-      <w:pPr>
-        <w:jc w:val="both"/>
-        <w:ind w:firstLine="720"/>
-        <w:spacing w:after="160"/>
-      </w:pPr>
-      <w:r>
-        <w:rPr>
-          <w:rFonts w:ascii="Times New Roman" w:hAnsi="Times New Roman"/>
-          <w:sz w:val="30"/>
-        </w:rPr>
-        <w:t xml:space="preserve">    Daşary ýurt raýatynyň Türkmenistana gelmeginiň, onda bolmagynyň we ondan gitmeginiň düzgünlerini berjaý etmegine jogapkärçiligi kompaniýamyz öz üstüne alýar.</w:t>
+        <w:t xml:space="preserve">{{ds.ProjectContract_Description}}</w:t>
+      </w:r>
+    </w:p>
+    <w:p>
+      <w:pPr>
+        <w:jc w:val="both"/>
+        <w:ind w:firstLine="720"/>
+        <w:spacing w:after="160"/>
+      </w:pPr>
+      <w:r>
+        <w:rPr>
+          <w:rFonts w:ascii="Times New Roman" w:hAnsi="Times New Roman"/>
+          <w:sz w:val="30"/>
+        </w:rPr>
+        <w:t xml:space="preserve">Şertname esasynda, öňde goýlan wezipeleri ýetinlikli durmuşa geçirmek üçin hatymyzyň goşundysynda görkezilen "{{ds.Company_Name}}" kompaniýasyna degişli bolan {{ds.TotalPersonCount}} ({{ds.TotalPersonCountText}}) sany daşary ýurt raýatynyň {{ds.MovementPermitLocation_NameTm}} iş rugsatnamalarynyň berilmegine ýardam bermegiňizi Sizden haýyş edýäris.</w:t>
+      </w:r>
+    </w:p>
+    <w:p>
+      <w:pPr>
+        <w:jc w:val="both"/>
+        <w:ind w:firstLine="720"/>
+        <w:spacing w:after="160"/>
+      </w:pPr>
+      <w:r>
+        <w:rPr>
+          <w:rFonts w:ascii="Times New Roman" w:hAnsi="Times New Roman"/>
+          <w:sz w:val="30"/>
+        </w:rPr>
+        <w:t xml:space="preserve">Daşary ýurt raýatynyň Türkmenistana gelmeginiň, onda bolmagynyň we ondan gitmeginiň düzgünlerini berjaý etmegine jogapkärçiligi kompaniýamyz öz üstüne alýar.</w:t>
       </w:r>
     </w:p>
     <w:p/>
@@ -120,33 +120,78 @@
       </w:r>
     </w:p>
     <w:p/>
-    <w:p>
-      <w:pPr>
-        <w:tabs>
-          <w:tab w:val="right" w:pos="8306"/>
-        </w:tabs>
-        <w:spacing w:before="480" w:after="0"/>
-      </w:pPr>
-      <w:r>
-        <w:rPr>
-          <w:rFonts w:ascii="Times New Roman" w:hAnsi="Times New Roman"/>
-          <w:sz w:val="30"/>
-          <w:b/>
-        </w:rPr>
-        <w:t xml:space="preserve">{{ds.Application_CompanyHead_PositionTm}}</w:t>
-      </w:r>
-      <w:r>
-        <w:tab/>
-      </w:r>
-      <w:r>
-        <w:rPr>
-          <w:rFonts w:ascii="Times New Roman" w:hAnsi="Times New Roman"/>
-          <w:sz w:val="30"/>
-          <w:b/>
-        </w:rPr>
-        <w:t xml:space="preserve">{{ds.Application_CompanyHead_FullName}}</w:t>
-      </w:r>
-    </w:p>
+    <w:tbl>
+      <w:tblPr>
+        <w:tblW w:w="8306" w:type="dxa"/>
+        <w:tblLayout w:type="fixed"/>
+        <w:tblBorders>
+          <w:top w:val="nil"/>
+          <w:left w:val="nil"/>
+          <w:bottom w:val="nil"/>
+          <w:right w:val="nil"/>
+          <w:insideH w:val="nil"/>
+          <w:insideV w:val="nil"/>
+        </w:tblBorders>
+      </w:tblPr>
+      <w:tblGrid>
+        <w:gridCol w:w="5200"/>
+        <w:gridCol w:w="3106"/>
+      </w:tblGrid>
+      <w:tr>
+        <w:tc>
+          <w:tcPr>
+            <w:tcW w:w="5200" w:type="dxa"/>
+            <w:vAlign w:val="top"/>
+            <w:tcBorders>
+              <w:top w:val="nil"/>
+              <w:left w:val="nil"/>
+              <w:bottom w:val="nil"/>
+              <w:right w:val="nil"/>
+            </w:tcBorders>
+          </w:tcPr>
+          <w:p>
+            <w:pPr>
+              <w:jc w:val="left"/>
+              <w:spacing w:before="480" w:after="0"/>
+            </w:pPr>
+            <w:r>
+              <w:rPr>
+                <w:rFonts w:ascii="Times New Roman" w:hAnsi="Times New Roman"/>
+                <w:sz w:val="30"/>
+                <w:b/>
+              </w:rPr>
+              <w:t xml:space="preserve">{{ds.Application_CompanyHead_PositionTm}}</w:t>
+            </w:r>
+          </w:p>
+        </w:tc>
+        <w:tc>
+          <w:tcPr>
+            <w:tcW w:w="3106" w:type="dxa"/>
+            <w:vAlign w:val="top"/>
+            <w:tcBorders>
+              <w:top w:val="nil"/>
+              <w:left w:val="nil"/>
+              <w:bottom w:val="nil"/>
+              <w:right w:val="nil"/>
+            </w:tcBorders>
+          </w:tcPr>
+          <w:p>
+            <w:pPr>
+              <w:jc w:val="right"/>
+              <w:spacing w:before="480" w:after="0"/>
+            </w:pPr>
+            <w:r>
+              <w:rPr>
+                <w:rFonts w:ascii="Times New Roman" w:hAnsi="Times New Roman"/>
+                <w:sz w:val="30"/>
+                <w:b/>
+              </w:rPr>
+              <w:t xml:space="preserve">{{ds.Application_CompanyHead_FullName}}</w:t>
+            </w:r>
+          </w:p>
+        </w:tc>
+      </w:tr>
+    </w:tbl>
     <w:sectPr>
       <w:pgSz w:w="11906" w:h="16838"/>
       <w:pgMar w:top="1440" w:right="1800" w:bottom="1440" w:left="1800"/>

</xml_diff>